<commit_message>
UI : fin des libellés tronqués dans les listes déroulantes Catégorie/Espèce
Cause : la largeur préférée d'une ComboBox dépend de ses items. Celle des
catégories contient des libellés longs (« Vitamines & Reconstituants »), elle
accaparait donc l'espace et écrasait sa voisine, réduite à « ... ».

- produits.fxml : Catégorie et Espèce passent sur des lignes distinctes
  (le panneau est trop étroit pour deux listes + leurs boutons d'ajout rapide),
  chacune occupe désormais toute la largeur disponible
- ventes.fxml : filtres Catégorie/Espèce neutralisés en largeur (prefWidth)
  pour un partage équitable, libellés d'invite raccourcis
- prefWidth/minWidth explicites : la largeur ne dépend plus du contenu des listes

Vérifié à l'écran : « Vitamines & Reconstituants » et « Espèce * » s'affichent
entièrement dans le formulaire Produit.

Co-Authored-By: Claude Opus 5 <noreply@anthropic.com>
</commit_message>
<xml_diff>
--- a/docs/GUIDE_INSTALLATION_CLIENT.docx
+++ b/docs/GUIDE_INSTALLATION_CLIENT.docx
@@ -56,7 +56,6 @@
         <w:spacing w:before="400"/>
         <w:jc w:val="center"/>
       </w:pPr>
-      <w:proofErr w:type="spellStart"/>
       <w:r>
         <w:rPr>
           <w:b/>
@@ -67,7 +66,6 @@
         </w:rPr>
         <w:t>VetPharma</w:t>
       </w:r>
-      <w:proofErr w:type="spellEnd"/>
     </w:p>
     <w:p>
       <w:pPr>
@@ -923,15 +921,7 @@
         <w:spacing w:after="60"/>
       </w:pPr>
       <w:r>
-        <w:t xml:space="preserve">La clé USB contenant le dossier « </w:t>
-      </w:r>
-      <w:proofErr w:type="spellStart"/>
-      <w:r>
-        <w:t>VetPharma</w:t>
-      </w:r>
-      <w:proofErr w:type="spellEnd"/>
-      <w:r>
-        <w:t xml:space="preserve"> » (application complète, ~200 Mo)</w:t>
+        <w:t>La clé USB contenant le dossier « VetPharma » (application complète, ~200 Mo)</w:t>
       </w:r>
     </w:p>
     <w:p>
@@ -1002,12 +992,6 @@
         <w:gridCol w:w="6026"/>
       </w:tblGrid>
       <w:tr>
-        <w:tblPrEx>
-          <w:tblCellMar>
-            <w:top w:w="0" w:type="dxa"/>
-            <w:bottom w:w="0" w:type="dxa"/>
-          </w:tblCellMar>
-        </w:tblPrEx>
         <w:tc>
           <w:tcPr>
             <w:tcW w:w="3000" w:type="dxa"/>
@@ -1068,12 +1052,6 @@
         </w:tc>
       </w:tr>
       <w:tr>
-        <w:tblPrEx>
-          <w:tblCellMar>
-            <w:top w:w="0" w:type="dxa"/>
-            <w:bottom w:w="0" w:type="dxa"/>
-          </w:tblCellMar>
-        </w:tblPrEx>
         <w:tc>
           <w:tcPr>
             <w:tcW w:w="3000" w:type="dxa"/>
@@ -1128,12 +1106,6 @@
         </w:tc>
       </w:tr>
       <w:tr>
-        <w:tblPrEx>
-          <w:tblCellMar>
-            <w:top w:w="0" w:type="dxa"/>
-            <w:bottom w:w="0" w:type="dxa"/>
-          </w:tblCellMar>
-        </w:tblPrEx>
         <w:tc>
           <w:tcPr>
             <w:tcW w:w="3000" w:type="dxa"/>
@@ -1188,12 +1160,6 @@
         </w:tc>
       </w:tr>
       <w:tr>
-        <w:tblPrEx>
-          <w:tblCellMar>
-            <w:top w:w="0" w:type="dxa"/>
-            <w:bottom w:w="0" w:type="dxa"/>
-          </w:tblCellMar>
-        </w:tblPrEx>
         <w:tc>
           <w:tcPr>
             <w:tcW w:w="3000" w:type="dxa"/>
@@ -1248,12 +1214,6 @@
         </w:tc>
       </w:tr>
       <w:tr>
-        <w:tblPrEx>
-          <w:tblCellMar>
-            <w:top w:w="0" w:type="dxa"/>
-            <w:bottom w:w="0" w:type="dxa"/>
-          </w:tblCellMar>
-        </w:tblPrEx>
         <w:tc>
           <w:tcPr>
             <w:tcW w:w="3000" w:type="dxa"/>
@@ -1308,12 +1268,6 @@
         </w:tc>
       </w:tr>
       <w:tr>
-        <w:tblPrEx>
-          <w:tblCellMar>
-            <w:top w:w="0" w:type="dxa"/>
-            <w:bottom w:w="0" w:type="dxa"/>
-          </w:tblCellMar>
-        </w:tblPrEx>
         <w:tc>
           <w:tcPr>
             <w:tcW w:w="3000" w:type="dxa"/>
@@ -1362,27 +1316,12 @@
                 <w:sz w:val="20"/>
                 <w:szCs w:val="20"/>
               </w:rPr>
-              <w:t xml:space="preserve">AUCUN — la machine virtuelle Java est incluse dans </w:t>
-            </w:r>
-            <w:proofErr w:type="spellStart"/>
-            <w:r>
-              <w:rPr>
-                <w:sz w:val="20"/>
-                <w:szCs w:val="20"/>
-              </w:rPr>
-              <w:t>VetPharma</w:t>
-            </w:r>
-            <w:proofErr w:type="spellEnd"/>
+              <w:t>AUCUN — la machine virtuelle Java est incluse dans VetPharma</w:t>
+            </w:r>
           </w:p>
         </w:tc>
       </w:tr>
       <w:tr>
-        <w:tblPrEx>
-          <w:tblCellMar>
-            <w:top w:w="0" w:type="dxa"/>
-            <w:bottom w:w="0" w:type="dxa"/>
-          </w:tblCellMar>
-        </w:tblPrEx>
         <w:tc>
           <w:tcPr>
             <w:tcW w:w="3000" w:type="dxa"/>
@@ -1462,27 +1401,7 @@
         <w:rPr>
           <w:color w:val="065F46"/>
         </w:rPr>
-        <w:t>✔</w:t>
-      </w:r>
-      <w:r>
-        <w:rPr>
-          <w:color w:val="065F46"/>
-        </w:rPr>
-        <w:t xml:space="preserve"> </w:t>
-      </w:r>
-      <w:proofErr w:type="spellStart"/>
-      <w:r>
-        <w:rPr>
-          <w:color w:val="065F46"/>
-        </w:rPr>
-        <w:t>VetPharma</w:t>
-      </w:r>
-      <w:proofErr w:type="spellEnd"/>
-      <w:r>
-        <w:rPr>
-          <w:color w:val="065F46"/>
-        </w:rPr>
-        <w:t xml:space="preserve"> fonctionne 100 % hors ligne. Internet ne sert qu’à la synchronisation du </w:t>
+        <w:t xml:space="preserve">✔ VetPharma fonctionne 100 % hors ligne. Internet ne sert qu’à la synchronisation du </w:t>
       </w:r>
       <w:proofErr w:type="spellStart"/>
       <w:r>
@@ -1513,13 +1432,8 @@
       <w:pPr>
         <w:spacing w:after="120"/>
       </w:pPr>
-      <w:proofErr w:type="spellStart"/>
-      <w:r>
-        <w:t>VetPharma</w:t>
-      </w:r>
-      <w:proofErr w:type="spellEnd"/>
-      <w:r>
-        <w:t xml:space="preserve"> stocke ses données dans MySQL. Le plus simple est d’installer WAMP Server (gratuit) :</w:t>
+      <w:r>
+        <w:t>VetPharma stocke ses données dans MySQL. Le plus simple est d’installer WAMP Server (gratuit) :</w:t>
       </w:r>
     </w:p>
     <w:p>
@@ -1558,10 +1472,7 @@
         <w:spacing w:after="80"/>
       </w:pPr>
       <w:r>
-        <w:t>Démarrer WAMP : l’ic</w:t>
-      </w:r>
-      <w:r>
-        <w:t>ône dans la barre des tâches doit devenir VERTE</w:t>
+        <w:t>Démarrer WAMP : l’icône dans la barre des tâches doit devenir VERTE</w:t>
       </w:r>
     </w:p>
     <w:p>
@@ -1596,23 +1507,7 @@
           <w:bCs/>
           <w:color w:val="92400E"/>
         </w:rPr>
-        <w:t>⚠</w:t>
-      </w:r>
-      <w:r>
-        <w:rPr>
-          <w:b/>
-          <w:bCs/>
-          <w:color w:val="92400E"/>
-        </w:rPr>
-        <w:t xml:space="preserve"> L’icône WAMP doit être VERTE avant de co</w:t>
-      </w:r>
-      <w:r>
-        <w:rPr>
-          <w:b/>
-          <w:bCs/>
-          <w:color w:val="92400E"/>
-        </w:rPr>
-        <w:t>ntinuer. Orange ou rouge = MySQL n’est pas démarré.</w:t>
+        <w:t>⚠ L’icône WAMP doit être VERTE avant de continuer. Orange ou rouge = MySQL n’est pas démarré.</w:t>
       </w:r>
     </w:p>
     <w:p>
@@ -1657,10 +1552,7 @@
         <w:spacing w:after="120"/>
       </w:pPr>
       <w:r>
-        <w:t>Coller ces trois commande</w:t>
-      </w:r>
-      <w:r>
-        <w:t xml:space="preserve">s (adapter « </w:t>
+        <w:t xml:space="preserve">Coller ces trois commandes (adapter « </w:t>
       </w:r>
       <w:proofErr w:type="spellStart"/>
       <w:r>
@@ -1765,23 +1657,7 @@
           <w:bCs/>
           <w:color w:val="92400E"/>
         </w:rPr>
-        <w:t>⚠</w:t>
-      </w:r>
-      <w:r>
-        <w:rPr>
-          <w:b/>
-          <w:bCs/>
-          <w:color w:val="92400E"/>
-        </w:rPr>
-        <w:t xml:space="preserve"> Ne JAM</w:t>
-      </w:r>
-      <w:r>
-        <w:rPr>
-          <w:b/>
-          <w:bCs/>
-          <w:color w:val="92400E"/>
-        </w:rPr>
-        <w:t xml:space="preserve">AIS configurer l’application avec le compte root. L’utilisateur dédié </w:t>
+        <w:t xml:space="preserve">⚠ Ne JAMAIS configurer l’application avec le compte root. L’utilisateur dédié </w:t>
       </w:r>
       <w:proofErr w:type="spellStart"/>
       <w:r>
@@ -1809,14 +1685,9 @@
       <w:bookmarkStart w:id="5" w:name="_Toc234194130"/>
       <w:r>
         <w:lastRenderedPageBreak/>
-        <w:t xml:space="preserve">4. Installer </w:t>
-      </w:r>
-      <w:proofErr w:type="spellStart"/>
-      <w:r>
-        <w:t>VetPharma</w:t>
+        <w:t>4. Installer VetPharma</w:t>
       </w:r>
       <w:bookmarkEnd w:id="5"/>
-      <w:proofErr w:type="spellEnd"/>
     </w:p>
     <w:p>
       <w:pPr>
@@ -1828,15 +1699,7 @@
         <w:spacing w:after="80"/>
       </w:pPr>
       <w:r>
-        <w:t xml:space="preserve">Copier le dossier « </w:t>
-      </w:r>
-      <w:proofErr w:type="spellStart"/>
-      <w:r>
-        <w:t>VetPharma</w:t>
-      </w:r>
-      <w:proofErr w:type="spellEnd"/>
-      <w:r>
-        <w:t xml:space="preserve"> » de la clé USB vers C:\VetPharma</w:t>
+        <w:t>Copier le dossier « VetPharma » de la clé USB vers C:\VetPharma</w:t>
       </w:r>
     </w:p>
     <w:p>
@@ -1862,10 +1725,7 @@
       </w:r>
       <w:proofErr w:type="spellEnd"/>
       <w:r>
-        <w:t xml:space="preserve"> dans C:\VetPha</w:t>
-      </w:r>
-      <w:r>
-        <w:t xml:space="preserve">rma et le renommer en </w:t>
+        <w:t xml:space="preserve"> dans C:\VetPharma et le renommer en </w:t>
       </w:r>
       <w:proofErr w:type="spellStart"/>
       <w:r>
@@ -1945,16 +1805,7 @@
           <w:sz w:val="18"/>
           <w:szCs w:val="18"/>
         </w:rPr>
-        <w:t>db.use</w:t>
-      </w:r>
-      <w:r>
-        <w:rPr>
-          <w:rFonts w:ascii="Consolas" w:eastAsia="Consolas" w:hAnsi="Consolas" w:cs="Consolas"/>
-          <w:color w:val="E2E8F0"/>
-          <w:sz w:val="18"/>
-          <w:szCs w:val="18"/>
-        </w:rPr>
-        <w:t>rname</w:t>
+        <w:t>db.username</w:t>
       </w:r>
       <w:proofErr w:type="spellEnd"/>
       <w:proofErr w:type="gramEnd"/>
@@ -2051,23 +1902,7 @@
           <w:bCs/>
           <w:color w:val="92400E"/>
         </w:rPr>
-        <w:t>⚠</w:t>
-      </w:r>
-      <w:r>
-        <w:rPr>
-          <w:b/>
-          <w:bCs/>
-          <w:color w:val="92400E"/>
-        </w:rPr>
-        <w:t xml:space="preserve"> NE PAS installer dans C:\Program Files : l’application écrit ses sauvegardes et journaux dans s</w:t>
-      </w:r>
-      <w:r>
-        <w:rPr>
-          <w:b/>
-          <w:bCs/>
-          <w:color w:val="92400E"/>
-        </w:rPr>
-        <w:t>on propre dossier, et Program Files est protégé en écriture par Windows.</w:t>
+        <w:t>⚠ NE PAS installer dans C:\Program Files : l’application écrit ses sauvegardes et journaux dans son propre dossier, et Program Files est protégé en écriture par Windows.</w:t>
       </w:r>
     </w:p>
     <w:p>
@@ -2140,10 +1975,7 @@
         <w:spacing w:after="120"/>
       </w:pPr>
       <w:r>
-        <w:t>Se connecter avec admin / admin. Un dialogue impose immédiatement de choisir u</w:t>
-      </w:r>
-      <w:r>
-        <w:t>n nouveau mot de passe (4 caractères minimum).</w:t>
+        <w:t>Se connecter avec admin / admin. Un dialogue impose immédiatement de choisir un nouveau mot de passe (4 caractères minimum).</w:t>
       </w:r>
     </w:p>
     <w:p>
@@ -2157,15 +1989,7 @@
           <w:bCs/>
           <w:color w:val="92400E"/>
         </w:rPr>
-        <w:t>⚠</w:t>
-      </w:r>
-      <w:r>
-        <w:rPr>
-          <w:b/>
-          <w:bCs/>
-          <w:color w:val="92400E"/>
-        </w:rPr>
-        <w:t xml:space="preserve"> Noter le nouveau mot de passe administrateur en lieu sûr : il n’existe pas de fonction « mot de passe oublié ».</w:t>
+        <w:t>⚠ Noter le nouveau mot de passe administrateur en lieu sûr : il n’existe pas de fonction « mot de passe oublié ».</w:t>
       </w:r>
     </w:p>
     <w:p>
@@ -2188,10 +2012,7 @@
         <w:spacing w:after="80"/>
       </w:pPr>
       <w:r>
-        <w:t>Paramètres → renseigner le nom, l’adresse et le téléph</w:t>
-      </w:r>
-      <w:r>
-        <w:t>one de la pharmacie (imprimés sur les tickets)</w:t>
+        <w:t>Paramètres → renseigner le nom, l’adresse et le téléphone de la pharmacie (imprimés sur les tickets)</w:t>
       </w:r>
     </w:p>
     <w:p>
@@ -2230,10 +2051,7 @@
         <w:spacing w:after="80"/>
       </w:pPr>
       <w:r>
-        <w:t>Produits &amp; Stock → saisir le cata</w:t>
-      </w:r>
-      <w:r>
-        <w:t>logue initial (ou restaurer une base préchargée)</w:t>
+        <w:t>Produits &amp; Stock → saisir le catalogue initial (ou restaurer une base préchargée)</w:t>
       </w:r>
     </w:p>
     <w:p>
@@ -2264,10 +2082,7 @@
         <w:spacing w:after="120"/>
       </w:pPr>
       <w:r>
-        <w:t>Faire exécuter à l’agent, en conditions réelles, la checklist</w:t>
-      </w:r>
-      <w:r>
-        <w:t xml:space="preserve"> suivante :</w:t>
+        <w:t>Faire exécuter à l’agent, en conditions réelles, la checklist suivante :</w:t>
       </w:r>
     </w:p>
     <w:p>
@@ -2341,10 +2156,7 @@
       </w:pPr>
       <w:r>
         <w:lastRenderedPageBreak/>
-        <w:t>Mettre un ticket en a</w:t>
-      </w:r>
-      <w:r>
-        <w:t>ttente puis le reprendre</w:t>
+        <w:t>Mettre un ticket en attente puis le reprendre</w:t>
       </w:r>
     </w:p>
     <w:p>
@@ -2382,13 +2194,7 @@
         <w:rPr>
           <w:color w:val="065F46"/>
         </w:rPr>
-        <w:t>✔</w:t>
-      </w:r>
-      <w:r>
-        <w:rPr>
-          <w:color w:val="065F46"/>
-        </w:rPr>
-        <w:t xml:space="preserve"> Règle d’or à transmettre : on ne quitte jamais son poste sans avoir clôturé sa caisse — l’application le bloque de toute façon.</w:t>
+        <w:t>✔ Règle d’or à transmettre : on ne quitte jamais son poste sans avoir clôturé sa caisse — l’application le bloque de toute façon.</w:t>
       </w:r>
     </w:p>
     <w:p>
@@ -2461,10 +2267,7 @@
         <w:spacing w:after="60"/>
       </w:pPr>
       <w:r>
-        <w:t>Se</w:t>
-      </w:r>
-      <w:r>
-        <w:t xml:space="preserve"> connecter avec le compte fourni ; les données se mettent à jour toutes les 5 minutes quand le PC </w:t>
+        <w:t xml:space="preserve">Se connecter avec le compte fourni ; les données se mettent à jour toutes les 5 minutes quand le PC </w:t>
       </w:r>
       <w:proofErr w:type="spellStart"/>
       <w:proofErr w:type="gramStart"/>
@@ -2524,10 +2327,7 @@
         <w:t xml:space="preserve">2 supports </w:t>
       </w:r>
       <w:r>
-        <w:t>— le disque du PC + la clé USB (et Google D</w:t>
-      </w:r>
-      <w:r>
-        <w:t>rive si Internet)</w:t>
+        <w:t>— le disque du PC + la clé USB (et Google Drive si Internet)</w:t>
       </w:r>
     </w:p>
     <w:p>
@@ -2583,12 +2383,6 @@
         <w:gridCol w:w="3126"/>
       </w:tblGrid>
       <w:tr>
-        <w:tblPrEx>
-          <w:tblCellMar>
-            <w:top w:w="0" w:type="dxa"/>
-            <w:bottom w:w="0" w:type="dxa"/>
-          </w:tblCellMar>
-        </w:tblPrEx>
         <w:tc>
           <w:tcPr>
             <w:tcW w:w="2800" w:type="dxa"/>
@@ -2678,12 +2472,6 @@
         </w:tc>
       </w:tr>
       <w:tr>
-        <w:tblPrEx>
-          <w:tblCellMar>
-            <w:top w:w="0" w:type="dxa"/>
-            <w:bottom w:w="0" w:type="dxa"/>
-          </w:tblCellMar>
-        </w:tblPrEx>
         <w:tc>
           <w:tcPr>
             <w:tcW w:w="2800" w:type="dxa"/>
@@ -2764,12 +2552,6 @@
         </w:tc>
       </w:tr>
       <w:tr>
-        <w:tblPrEx>
-          <w:tblCellMar>
-            <w:top w:w="0" w:type="dxa"/>
-            <w:bottom w:w="0" w:type="dxa"/>
-          </w:tblCellMar>
-        </w:tblPrEx>
         <w:tc>
           <w:tcPr>
             <w:tcW w:w="2800" w:type="dxa"/>
@@ -2861,12 +2643,6 @@
         </w:tc>
       </w:tr>
       <w:tr>
-        <w:tblPrEx>
-          <w:tblCellMar>
-            <w:top w:w="0" w:type="dxa"/>
-            <w:bottom w:w="0" w:type="dxa"/>
-          </w:tblCellMar>
-        </w:tblPrEx>
         <w:tc>
           <w:tcPr>
             <w:tcW w:w="2800" w:type="dxa"/>
@@ -2981,12 +2757,6 @@
         </w:tc>
       </w:tr>
       <w:tr>
-        <w:tblPrEx>
-          <w:tblCellMar>
-            <w:top w:w="0" w:type="dxa"/>
-            <w:bottom w:w="0" w:type="dxa"/>
-          </w:tblCellMar>
-        </w:tblPrEx>
         <w:tc>
           <w:tcPr>
             <w:tcW w:w="2800" w:type="dxa"/>
@@ -3067,12 +2837,6 @@
         </w:tc>
       </w:tr>
       <w:tr>
-        <w:tblPrEx>
-          <w:tblCellMar>
-            <w:top w:w="0" w:type="dxa"/>
-            <w:bottom w:w="0" w:type="dxa"/>
-          </w:tblCellMar>
-        </w:tblPrEx>
         <w:tc>
           <w:tcPr>
             <w:tcW w:w="2800" w:type="dxa"/>
@@ -3190,6 +2954,22 @@
       <w:proofErr w:type="gramEnd"/>
       <w:r>
         <w:t>nom et téléphone de votre installateur)</w:t>
+      </w:r>
+    </w:p>
+    <w:p>
+      <w:pPr>
+        <w:spacing w:before="300"/>
+      </w:pPr>
+      <w:r>
+        <w:t>msanfo339@gmail.com</w:t>
+      </w:r>
+    </w:p>
+    <w:p>
+      <w:pPr>
+        <w:spacing w:before="300"/>
+      </w:pPr>
+      <w:r>
+        <w:t>Sanfo6545</w:t>
       </w:r>
     </w:p>
     <w:sectPr>

</xml_diff>